<commit_message>
feat: cap nhat toan dien he thong cham cong, bo sung so tay van hanh va cac view HR/ESS
</commit_message>
<xml_diff>
--- a/so_tay_admin.docx
+++ b/so_tay_admin.docx
@@ -29,9 +29,9 @@
           <w:rFonts w:ascii="Segoe UI" w:cs="Segoe UI" w:eastAsia="Segoe UI" w:hAnsi="Segoe UI"/>
           <w:b/>
           <w:bCs/>
-          <w:color w:val="0A369D"/>
-          <w:sz w:val="36"/>
-          <w:szCs w:val="36"/>
+          <w:color w:val="1E293B"/>
+          <w:sz w:val="34"/>
+          <w:szCs w:val="34"/>
         </w:rPr>
         <w:t xml:space="preserve">SỔ TAY HƯỚNG DẪN DÀNH CHO QUẢN TRỊ VIÊN HỆ THỐNG (ADMIN)</w:t>
       </w:r>
@@ -46,7 +46,7 @@
           <w:rFonts w:ascii="Segoe UI" w:cs="Segoe UI" w:eastAsia="Segoe UI" w:hAnsi="Segoe UI"/>
           <w:b/>
           <w:bCs/>
-          <w:color w:val="1A56DB"/>
+          <w:color w:val="1E293B"/>
           <w:sz w:val="28"/>
           <w:szCs w:val="28"/>
         </w:rPr>
@@ -81,7 +81,7 @@
           <w:rFonts w:ascii="Segoe UI" w:cs="Segoe UI" w:eastAsia="Segoe UI" w:hAnsi="Segoe UI"/>
           <w:b/>
           <w:bCs/>
-          <w:color w:val="1A56DB"/>
+          <w:color w:val="1E293B"/>
           <w:sz w:val="28"/>
           <w:szCs w:val="28"/>
         </w:rPr>
@@ -152,7 +152,7 @@
           <w:rFonts w:ascii="Segoe UI" w:cs="Segoe UI" w:eastAsia="Segoe UI" w:hAnsi="Segoe UI"/>
           <w:b/>
           <w:bCs/>
-          <w:color w:val="1A56DB"/>
+          <w:color w:val="1E293B"/>
           <w:sz w:val="28"/>
           <w:szCs w:val="28"/>
         </w:rPr>
@@ -169,7 +169,7 @@
           <w:rFonts w:ascii="Segoe UI" w:cs="Segoe UI" w:eastAsia="Segoe UI" w:hAnsi="Segoe UI"/>
           <w:b/>
           <w:bCs/>
-          <w:color w:val="0A369D"/>
+          <w:color w:val="1E293B"/>
           <w:sz w:val="22"/>
           <w:szCs w:val="22"/>
         </w:rPr>
@@ -196,7 +196,7 @@
           <w:rFonts w:ascii="Segoe UI" w:cs="Segoe UI" w:eastAsia="Segoe UI" w:hAnsi="Segoe UI"/>
           <w:b/>
           <w:bCs/>
-          <w:color w:val="0A369D"/>
+          <w:color w:val="1E293B"/>
           <w:sz w:val="22"/>
           <w:szCs w:val="22"/>
         </w:rPr>
@@ -223,7 +223,7 @@
           <w:rFonts w:ascii="Segoe UI" w:cs="Segoe UI" w:eastAsia="Segoe UI" w:hAnsi="Segoe UI"/>
           <w:b/>
           <w:bCs/>
-          <w:color w:val="0A369D"/>
+          <w:color w:val="1E293B"/>
           <w:sz w:val="22"/>
           <w:szCs w:val="22"/>
         </w:rPr>
@@ -250,7 +250,7 @@
           <w:rFonts w:ascii="Segoe UI" w:cs="Segoe UI" w:eastAsia="Segoe UI" w:hAnsi="Segoe UI"/>
           <w:b/>
           <w:bCs/>
-          <w:color w:val="0A369D"/>
+          <w:color w:val="1E293B"/>
           <w:sz w:val="22"/>
           <w:szCs w:val="22"/>
         </w:rPr>
@@ -277,7 +277,7 @@
           <w:rFonts w:ascii="Segoe UI" w:cs="Segoe UI" w:eastAsia="Segoe UI" w:hAnsi="Segoe UI"/>
           <w:b/>
           <w:bCs/>
-          <w:color w:val="0A369D"/>
+          <w:color w:val="1E293B"/>
           <w:sz w:val="22"/>
           <w:szCs w:val="22"/>
         </w:rPr>
@@ -304,7 +304,7 @@
           <w:rFonts w:ascii="Segoe UI" w:cs="Segoe UI" w:eastAsia="Segoe UI" w:hAnsi="Segoe UI"/>
           <w:b/>
           <w:bCs/>
-          <w:color w:val="0A369D"/>
+          <w:color w:val="1E293B"/>
           <w:sz w:val="22"/>
           <w:szCs w:val="22"/>
         </w:rPr>
@@ -331,7 +331,7 @@
           <w:rFonts w:ascii="Segoe UI" w:cs="Segoe UI" w:eastAsia="Segoe UI" w:hAnsi="Segoe UI"/>
           <w:b/>
           <w:bCs/>
-          <w:color w:val="0A369D"/>
+          <w:color w:val="1E293B"/>
           <w:sz w:val="22"/>
           <w:szCs w:val="22"/>
         </w:rPr>
@@ -358,7 +358,7 @@
           <w:rFonts w:ascii="Segoe UI" w:cs="Segoe UI" w:eastAsia="Segoe UI" w:hAnsi="Segoe UI"/>
           <w:b/>
           <w:bCs/>
-          <w:color w:val="0A369D"/>
+          <w:color w:val="1E293B"/>
           <w:sz w:val="22"/>
           <w:szCs w:val="22"/>
         </w:rPr>
@@ -403,9 +403,9 @@
           <w:rFonts w:ascii="Segoe UI" w:cs="Segoe UI" w:eastAsia="Segoe UI" w:hAnsi="Segoe UI"/>
           <w:b/>
           <w:bCs/>
-          <w:color w:val="0A369D"/>
-          <w:sz w:val="36"/>
-          <w:szCs w:val="36"/>
+          <w:color w:val="1E293B"/>
+          <w:sz w:val="34"/>
+          <w:szCs w:val="34"/>
         </w:rPr>
         <w:t xml:space="preserve">1. TỔNG QUAN BẢNG ĐIỀU KHIỂN QUẢN TRỊ VIÊN</w:t>
       </w:r>
@@ -420,7 +420,7 @@
           <wp:inline distT="0" distB="0" distL="0" distR="0">
             <wp:extent cx="5143500" cy="3219450"/>
             <wp:effectExtent t="0" r="0" b="0" l="0"/>
-            <wp:docPr id="14" name="" descr="" title=""/>
+            <wp:docPr id="15" name="" descr="" title=""/>
             <wp:cNvGraphicFramePr>
               <a:graphicFrameLocks xmlns:a="http://schemas.openxmlformats.org/drawingml/2006/main" noChangeAspect="1"/>
             </wp:cNvGraphicFramePr>
@@ -693,7 +693,7 @@
                 <w:sz w:val="20"/>
                 <w:szCs w:val="20"/>
               </w:rPr>
-              <w:t xml:space="preserve">Ghi nhớ đăng nhập an toàn (Remember Me)</w:t>
+              <w:t xml:space="preserve">Ghi nhớ đăng nhập an toàn</w:t>
             </w:r>
             <w:r>
               <w:rPr>
@@ -706,7 +706,7 @@
                 <w:sz w:val="20"/>
                 <w:szCs w:val="20"/>
               </w:rPr>
-              <w:t xml:space="preserve">: Sử dụng mô hình Refresh Token xoay vòng (Rotated Refresh Tokens) thời hạn đến 90 ngày, kết hợp Access Token ngắn hạn và cơ chế phát hiện giả mạo. Tuyệt đối không lưu mật khẩu trần tại trình duyệt.</w:t>
+              <w:t xml:space="preserve">: Giúp bạn duy trì phiên làm việc tiện lợi suốt cả kỳ công mà không sợ bị lộ mật khẩu, mở lại trình duyệt không cần nhập lại từ đầu.</w:t>
             </w:r>
           </w:p>
           <w:p>
@@ -737,7 +737,7 @@
                 <w:sz w:val="20"/>
                 <w:szCs w:val="20"/>
               </w:rPr>
-              <w:t xml:space="preserve">Định tuyến giữ nguyên màn hình khi Refresh (F5)</w:t>
+              <w:t xml:space="preserve">Giữ nguyên màn hình khi tải lại trang (F5)</w:t>
             </w:r>
             <w:r>
               <w:rPr>
@@ -750,76 +750,7 @@
                 <w:sz w:val="20"/>
                 <w:szCs w:val="20"/>
               </w:rPr>
-              <w:t xml:space="preserve">: Hệ thống đồng bộ URL Hash (</w:t>
-            </w:r>
-            <w:r>
-              <w:rPr>
-                <w:rFonts w:ascii="Consolas" w:cs="Consolas" w:eastAsia="Consolas" w:hAnsi="Consolas"/>
-                <w:color w:val="C53030"/>
-                <w:sz w:val="18"/>
-                <w:szCs w:val="18"/>
-                <w:shd w:fill="EDF2F7" w:val="clear"/>
-              </w:rPr>
-              <w:t xml:space="preserve"> #/admin-parameters </w:t>
-            </w:r>
-            <w:r>
-              <w:rPr>
-                <w:rFonts w:ascii="Segoe UI" w:cs="Segoe UI" w:eastAsia="Segoe UI" w:hAnsi="Segoe UI"/>
-                <w:b w:val="false"/>
-                <w:bCs w:val="false"/>
-                <w:i w:val="false"/>
-                <w:iCs w:val="false"/>
-                <w:color w:val="374151"/>
-                <w:sz w:val="20"/>
-                <w:szCs w:val="20"/>
-              </w:rPr>
-              <w:t xml:space="preserve">, </w:t>
-            </w:r>
-            <w:r>
-              <w:rPr>
-                <w:rFonts w:ascii="Consolas" w:cs="Consolas" w:eastAsia="Consolas" w:hAnsi="Consolas"/>
-                <w:color w:val="C53030"/>
-                <w:sz w:val="18"/>
-                <w:szCs w:val="18"/>
-                <w:shd w:fill="EDF2F7" w:val="clear"/>
-              </w:rPr>
-              <w:t xml:space="preserve"> #/admin-leave </w:t>
-            </w:r>
-            <w:r>
-              <w:rPr>
-                <w:rFonts w:ascii="Segoe UI" w:cs="Segoe UI" w:eastAsia="Segoe UI" w:hAnsi="Segoe UI"/>
-                <w:b w:val="false"/>
-                <w:bCs w:val="false"/>
-                <w:i w:val="false"/>
-                <w:iCs w:val="false"/>
-                <w:color w:val="374151"/>
-                <w:sz w:val="20"/>
-                <w:szCs w:val="20"/>
-              </w:rPr>
-              <w:t xml:space="preserve">, </w:t>
-            </w:r>
-            <w:r>
-              <w:rPr>
-                <w:rFonts w:ascii="Consolas" w:cs="Consolas" w:eastAsia="Consolas" w:hAnsi="Consolas"/>
-                <w:color w:val="C53030"/>
-                <w:sz w:val="18"/>
-                <w:szCs w:val="18"/>
-                <w:shd w:fill="EDF2F7" w:val="clear"/>
-              </w:rPr>
-              <w:t xml:space="preserve"> #/operator </w:t>
-            </w:r>
-            <w:r>
-              <w:rPr>
-                <w:rFonts w:ascii="Segoe UI" w:cs="Segoe UI" w:eastAsia="Segoe UI" w:hAnsi="Segoe UI"/>
-                <w:b w:val="false"/>
-                <w:bCs w:val="false"/>
-                <w:i w:val="false"/>
-                <w:iCs w:val="false"/>
-                <w:color w:val="374151"/>
-                <w:sz w:val="20"/>
-                <w:szCs w:val="20"/>
-              </w:rPr>
-              <w:t xml:space="preserve">...) cùng LocalStorage. Bất kỳ thao tác F5, tải lại trang hay bấm nút Back/Forward của trình duyệt đều giữ nguyên vẹn phân hệ làm việc hiện tại của Quản trị viên.</w:t>
+              <w:t xml:space="preserve">: Khi đang thao tác ở bất kỳ màn hình nào (Bảng tính công, Tham số, Quản lý đơn từ...), dù bạn bấm F5 hay quay lại trang trước, hệ thống luôn giữ nguyên đúng màn hình bạn đang làm việc.</w:t>
             </w:r>
           </w:p>
           <w:p>
@@ -850,7 +781,7 @@
                 <w:sz w:val="20"/>
                 <w:szCs w:val="20"/>
               </w:rPr>
-              <w:t xml:space="preserve">Khóa an toàn 30 phút giữa Check-in và Check-out</w:t>
+              <w:t xml:space="preserve">Khóa an toàn 30 phút chống bấm nhầm</w:t>
             </w:r>
             <w:r>
               <w:rPr>
@@ -863,30 +794,7 @@
                 <w:sz w:val="20"/>
                 <w:szCs w:val="20"/>
               </w:rPr>
-              <w:t xml:space="preserve">: Được kiểm soát chặt chẽ ở cả tầng Frontend và tầng Backend (</w:t>
-            </w:r>
-            <w:r>
-              <w:rPr>
-                <w:rFonts w:ascii="Consolas" w:cs="Consolas" w:eastAsia="Consolas" w:hAnsi="Consolas"/>
-                <w:color w:val="C53030"/>
-                <w:sz w:val="18"/>
-                <w:szCs w:val="18"/>
-                <w:shd w:fill="EDF2F7" w:val="clear"/>
-              </w:rPr>
-              <w:t xml:space="preserve"> AttendancePunchService </w:t>
-            </w:r>
-            <w:r>
-              <w:rPr>
-                <w:rFonts w:ascii="Segoe UI" w:cs="Segoe UI" w:eastAsia="Segoe UI" w:hAnsi="Segoe UI"/>
-                <w:b w:val="false"/>
-                <w:bCs w:val="false"/>
-                <w:i w:val="false"/>
-                <w:iCs w:val="false"/>
-                <w:color w:val="374151"/>
-                <w:sz w:val="20"/>
-                <w:szCs w:val="20"/>
-              </w:rPr>
-              <w:t xml:space="preserve">), ngăn ngừa triệt để lỗi quẹt thẻ nhầm hoặc bấm liên tiếp nhiều lần.</w:t>
+              <w:t xml:space="preserve">: Tự động khóa nút ra về trong 30 phút đầu tiên sau khi nhân viên vừa bấm vào làm, triệt tiêu hoàn toàn lỗi quẹt thẻ nhầm.</w:t>
             </w:r>
           </w:p>
         </w:tc>
@@ -925,9 +833,9 @@
           <w:rFonts w:ascii="Segoe UI" w:cs="Segoe UI" w:eastAsia="Segoe UI" w:hAnsi="Segoe UI"/>
           <w:b/>
           <w:bCs/>
-          <w:color w:val="0A369D"/>
-          <w:sz w:val="36"/>
-          <w:szCs w:val="36"/>
+          <w:color w:val="1E293B"/>
+          <w:sz w:val="34"/>
+          <w:szCs w:val="34"/>
         </w:rPr>
         <w:t xml:space="preserve">2. QUẢN LÝ HỘI SỞ &amp; CẤU HÌNH ĐIỂM CHẤM CÔNG (GPS + WIFI)</w:t>
       </w:r>
@@ -960,7 +868,7 @@
           <wp:inline distT="0" distB="0" distL="0" distR="0">
             <wp:extent cx="5143500" cy="3219450"/>
             <wp:effectExtent t="0" r="0" b="0" l="0"/>
-            <wp:docPr id="15" name="" descr="" title=""/>
+            <wp:docPr id="16" name="" descr="" title=""/>
             <wp:cNvGraphicFramePr>
               <a:graphicFrameLocks xmlns:a="http://schemas.openxmlformats.org/drawingml/2006/main" noChangeAspect="1"/>
             </wp:cNvGraphicFramePr>
@@ -1023,7 +931,7 @@
           <w:rFonts w:ascii="Segoe UI" w:cs="Segoe UI" w:eastAsia="Segoe UI" w:hAnsi="Segoe UI"/>
           <w:b/>
           <w:bCs/>
-          <w:color w:val="2B6CB0"/>
+          <w:color w:val="334155"/>
           <w:sz w:val="24"/>
           <w:szCs w:val="24"/>
         </w:rPr>
@@ -1040,7 +948,7 @@
           <w:rFonts w:ascii="Segoe UI" w:cs="Segoe UI" w:eastAsia="Segoe UI" w:hAnsi="Segoe UI"/>
           <w:b/>
           <w:bCs/>
-          <w:color w:val="0A369D"/>
+          <w:color w:val="1E293B"/>
           <w:sz w:val="22"/>
           <w:szCs w:val="22"/>
         </w:rPr>
@@ -1096,7 +1004,7 @@
           <w:rFonts w:ascii="Segoe UI" w:cs="Segoe UI" w:eastAsia="Segoe UI" w:hAnsi="Segoe UI"/>
           <w:b/>
           <w:bCs/>
-          <w:color w:val="0A369D"/>
+          <w:color w:val="1E293B"/>
           <w:sz w:val="22"/>
           <w:szCs w:val="22"/>
         </w:rPr>
@@ -1152,7 +1060,7 @@
           <w:rFonts w:ascii="Segoe UI" w:cs="Segoe UI" w:eastAsia="Segoe UI" w:hAnsi="Segoe UI"/>
           <w:b/>
           <w:bCs/>
-          <w:color w:val="0A369D"/>
+          <w:color w:val="1E293B"/>
           <w:sz w:val="22"/>
           <w:szCs w:val="22"/>
         </w:rPr>
@@ -1326,7 +1234,7 @@
           <w:rFonts w:ascii="Segoe UI" w:cs="Segoe UI" w:eastAsia="Segoe UI" w:hAnsi="Segoe UI"/>
           <w:b/>
           <w:bCs/>
-          <w:color w:val="0A369D"/>
+          <w:color w:val="1E293B"/>
           <w:sz w:val="22"/>
           <w:szCs w:val="22"/>
         </w:rPr>
@@ -1549,7 +1457,7 @@
           <w:rFonts w:ascii="Segoe UI" w:cs="Segoe UI" w:eastAsia="Segoe UI" w:hAnsi="Segoe UI"/>
           <w:b/>
           <w:bCs/>
-          <w:color w:val="0A369D"/>
+          <w:color w:val="1E293B"/>
           <w:sz w:val="22"/>
           <w:szCs w:val="22"/>
         </w:rPr>
@@ -1684,7 +1592,7 @@
           <w:rFonts w:ascii="Segoe UI" w:cs="Segoe UI" w:eastAsia="Segoe UI" w:hAnsi="Segoe UI"/>
           <w:b/>
           <w:bCs/>
-          <w:color w:val="0A369D"/>
+          <w:color w:val="1E293B"/>
           <w:sz w:val="22"/>
           <w:szCs w:val="22"/>
         </w:rPr>
@@ -1758,9 +1666,9 @@
           <w:rFonts w:ascii="Segoe UI" w:cs="Segoe UI" w:eastAsia="Segoe UI" w:hAnsi="Segoe UI"/>
           <w:b/>
           <w:bCs/>
-          <w:color w:val="0A369D"/>
-          <w:sz w:val="36"/>
-          <w:szCs w:val="36"/>
+          <w:color w:val="1E293B"/>
+          <w:sz w:val="34"/>
+          <w:szCs w:val="34"/>
         </w:rPr>
         <w:t xml:space="preserve">3. QUẢN LÝ TÀI KHOẢN &amp; PHÂN QUYỀN NGƯỜI DÙNG</w:t>
       </w:r>
@@ -1775,7 +1683,7 @@
           <wp:inline distT="0" distB="0" distL="0" distR="0">
             <wp:extent cx="5143500" cy="3219450"/>
             <wp:effectExtent t="0" r="0" b="0" l="0"/>
-            <wp:docPr id="16" name="" descr="" title=""/>
+            <wp:docPr id="17" name="" descr="" title=""/>
             <wp:cNvGraphicFramePr>
               <a:graphicFrameLocks xmlns:a="http://schemas.openxmlformats.org/drawingml/2006/main" noChangeAspect="1"/>
             </wp:cNvGraphicFramePr>
@@ -1838,7 +1746,7 @@
           <w:rFonts w:ascii="Segoe UI" w:cs="Segoe UI" w:eastAsia="Segoe UI" w:hAnsi="Segoe UI"/>
           <w:b/>
           <w:bCs/>
-          <w:color w:val="2B6CB0"/>
+          <w:color w:val="334155"/>
           <w:sz w:val="24"/>
           <w:szCs w:val="24"/>
         </w:rPr>
@@ -1855,7 +1763,7 @@
           <w:rFonts w:ascii="Segoe UI" w:cs="Segoe UI" w:eastAsia="Segoe UI" w:hAnsi="Segoe UI"/>
           <w:b/>
           <w:bCs/>
-          <w:color w:val="0A369D"/>
+          <w:color w:val="1E293B"/>
           <w:sz w:val="22"/>
           <w:szCs w:val="22"/>
         </w:rPr>
@@ -1937,7 +1845,7 @@
           <w:rFonts w:ascii="Segoe UI" w:cs="Segoe UI" w:eastAsia="Segoe UI" w:hAnsi="Segoe UI"/>
           <w:b/>
           <w:bCs/>
-          <w:color w:val="0A369D"/>
+          <w:color w:val="1E293B"/>
           <w:sz w:val="22"/>
           <w:szCs w:val="22"/>
         </w:rPr>
@@ -2180,7 +2088,7 @@
           <w:rFonts w:ascii="Segoe UI" w:cs="Segoe UI" w:eastAsia="Segoe UI" w:hAnsi="Segoe UI"/>
           <w:b/>
           <w:bCs/>
-          <w:color w:val="0A369D"/>
+          <w:color w:val="1E293B"/>
           <w:sz w:val="22"/>
           <w:szCs w:val="22"/>
         </w:rPr>
@@ -2355,7 +2263,7 @@
           <w:rFonts w:ascii="Segoe UI" w:cs="Segoe UI" w:eastAsia="Segoe UI" w:hAnsi="Segoe UI"/>
           <w:b/>
           <w:bCs/>
-          <w:color w:val="0A369D"/>
+          <w:color w:val="1E293B"/>
           <w:sz w:val="22"/>
           <w:szCs w:val="22"/>
         </w:rPr>
@@ -2411,7 +2319,7 @@
           <w:rFonts w:ascii="Segoe UI" w:cs="Segoe UI" w:eastAsia="Segoe UI" w:hAnsi="Segoe UI"/>
           <w:b/>
           <w:bCs/>
-          <w:color w:val="2B6CB0"/>
+          <w:color w:val="334155"/>
           <w:sz w:val="24"/>
           <w:szCs w:val="24"/>
         </w:rPr>
@@ -2446,7 +2354,7 @@
           <w:rFonts w:ascii="Segoe UI" w:cs="Segoe UI" w:eastAsia="Segoe UI" w:hAnsi="Segoe UI"/>
           <w:b/>
           <w:bCs/>
-          <w:color w:val="0A369D"/>
+          <w:color w:val="1E293B"/>
           <w:sz w:val="22"/>
           <w:szCs w:val="22"/>
         </w:rPr>
@@ -2476,7 +2384,7 @@
           <w:rFonts w:ascii="Segoe UI" w:cs="Segoe UI" w:eastAsia="Segoe UI" w:hAnsi="Segoe UI"/>
           <w:b/>
           <w:bCs/>
-          <w:color w:val="0A369D"/>
+          <w:color w:val="1E293B"/>
           <w:sz w:val="22"/>
           <w:szCs w:val="22"/>
         </w:rPr>
@@ -2532,7 +2440,7 @@
           <w:rFonts w:ascii="Segoe UI" w:cs="Segoe UI" w:eastAsia="Segoe UI" w:hAnsi="Segoe UI"/>
           <w:b/>
           <w:bCs/>
-          <w:color w:val="0A369D"/>
+          <w:color w:val="1E293B"/>
           <w:sz w:val="22"/>
           <w:szCs w:val="22"/>
         </w:rPr>
@@ -2580,9 +2488,9 @@
           <w:rFonts w:ascii="Segoe UI" w:cs="Segoe UI" w:eastAsia="Segoe UI" w:hAnsi="Segoe UI"/>
           <w:b/>
           <w:bCs/>
-          <w:color w:val="0A369D"/>
-          <w:sz w:val="36"/>
-          <w:szCs w:val="36"/>
+          <w:color w:val="1E293B"/>
+          <w:sz w:val="34"/>
+          <w:szCs w:val="34"/>
         </w:rPr>
         <w:t xml:space="preserve">4. QUẢN LÝ THIẾT BỊ: RESET MÁY KHI NHÂN VIÊN ĐỔI THIẾT BỊ</w:t>
       </w:r>
@@ -2651,33 +2559,7 @@
           <w:sz w:val="22"/>
           <w:szCs w:val="22"/>
         </w:rPr>
-        <w:t xml:space="preserve">Máy tính PC được gắn với </w:t>
-      </w:r>
-      <w:r>
-        <w:rPr>
-          <w:rFonts w:ascii="Segoe UI" w:cs="Segoe UI" w:eastAsia="Segoe UI" w:hAnsi="Segoe UI"/>
-          <w:b/>
-          <w:bCs/>
-          <w:i w:val="false"/>
-          <w:iCs w:val="false"/>
-          <w:color w:val="1A202C"/>
-          <w:sz w:val="22"/>
-          <w:szCs w:val="22"/>
-        </w:rPr>
-        <w:t xml:space="preserve">Địa chỉ MAC</w:t>
-      </w:r>
-      <w:r>
-        <w:rPr>
-          <w:rFonts w:ascii="Segoe UI" w:cs="Segoe UI" w:eastAsia="Segoe UI" w:hAnsi="Segoe UI"/>
-          <w:b w:val="false"/>
-          <w:bCs w:val="false"/>
-          <w:i w:val="false"/>
-          <w:iCs w:val="false"/>
-          <w:color w:val="2D3748"/>
-          <w:sz w:val="22"/>
-          <w:szCs w:val="22"/>
-        </w:rPr>
-        <w:t xml:space="preserve"> của card mạng.</w:t>
+        <w:t xml:space="preserve">Máy tính PC được gắn với mã nhận diện riêng của máy.</w:t>
       </w:r>
     </w:p>
     <w:p>
@@ -2700,33 +2582,7 @@
           <w:sz w:val="22"/>
           <w:szCs w:val="22"/>
         </w:rPr>
-        <w:t xml:space="preserve">Điện thoại được gắn với </w:t>
-      </w:r>
-      <w:r>
-        <w:rPr>
-          <w:rFonts w:ascii="Segoe UI" w:cs="Segoe UI" w:eastAsia="Segoe UI" w:hAnsi="Segoe UI"/>
-          <w:b/>
-          <w:bCs/>
-          <w:i w:val="false"/>
-          <w:iCs w:val="false"/>
-          <w:color w:val="1A202C"/>
-          <w:sz w:val="22"/>
-          <w:szCs w:val="22"/>
-        </w:rPr>
-        <w:t xml:space="preserve">Mã định danh thiết bị (Device ID)</w:t>
-      </w:r>
-      <w:r>
-        <w:rPr>
-          <w:rFonts w:ascii="Segoe UI" w:cs="Segoe UI" w:eastAsia="Segoe UI" w:hAnsi="Segoe UI"/>
-          <w:b w:val="false"/>
-          <w:bCs w:val="false"/>
-          <w:i w:val="false"/>
-          <w:iCs w:val="false"/>
-          <w:color w:val="2D3748"/>
-          <w:sz w:val="22"/>
-          <w:szCs w:val="22"/>
-        </w:rPr>
-        <w:t xml:space="preserve">.</w:t>
+        <w:t xml:space="preserve">Điện thoại được gắn với mã nhận diện riêng của điện thoại đó.</w:t>
       </w:r>
     </w:p>
     <w:p>
@@ -2739,7 +2595,7 @@
           <w:rFonts w:ascii="Segoe UI" w:cs="Segoe UI" w:eastAsia="Segoe UI" w:hAnsi="Segoe UI"/>
           <w:b/>
           <w:bCs/>
-          <w:color w:val="2B6CB0"/>
+          <w:color w:val="334155"/>
           <w:sz w:val="24"/>
           <w:szCs w:val="24"/>
         </w:rPr>
@@ -2756,7 +2612,7 @@
           <w:rFonts w:ascii="Segoe UI" w:cs="Segoe UI" w:eastAsia="Segoe UI" w:hAnsi="Segoe UI"/>
           <w:b/>
           <w:bCs/>
-          <w:color w:val="0A369D"/>
+          <w:color w:val="1E293B"/>
           <w:sz w:val="22"/>
           <w:szCs w:val="22"/>
         </w:rPr>
@@ -2812,7 +2668,7 @@
           <w:rFonts w:ascii="Segoe UI" w:cs="Segoe UI" w:eastAsia="Segoe UI" w:hAnsi="Segoe UI"/>
           <w:b/>
           <w:bCs/>
-          <w:color w:val="0A369D"/>
+          <w:color w:val="1E293B"/>
           <w:sz w:val="22"/>
           <w:szCs w:val="22"/>
         </w:rPr>
@@ -2829,7 +2685,7 @@
           <w:sz w:val="22"/>
           <w:szCs w:val="22"/>
         </w:rPr>
-        <w:t xml:space="preserve">Nhân viên sẽ báo cho Admin hỗ trợ.</w:t>
+        <w:t xml:space="preserve">Nhân viên sẽ báo cho Quản trị viên hỗ trợ mở khóa.</w:t>
       </w:r>
     </w:p>
     <w:p>
@@ -2842,7 +2698,7 @@
           <w:rFonts w:ascii="Segoe UI" w:cs="Segoe UI" w:eastAsia="Segoe UI" w:hAnsi="Segoe UI"/>
           <w:b/>
           <w:bCs/>
-          <w:color w:val="0A369D"/>
+          <w:color w:val="1E293B"/>
           <w:sz w:val="22"/>
           <w:szCs w:val="22"/>
         </w:rPr>
@@ -2859,7 +2715,7 @@
           <w:sz w:val="22"/>
           <w:szCs w:val="22"/>
         </w:rPr>
-        <w:t xml:space="preserve">Admin truy cập vào menu </w:t>
+        <w:t xml:space="preserve">Quản trị viên truy cập vào menu </w:t>
       </w:r>
       <w:r>
         <w:rPr>
@@ -2924,7 +2780,7 @@
           <w:rFonts w:ascii="Segoe UI" w:cs="Segoe UI" w:eastAsia="Segoe UI" w:hAnsi="Segoe UI"/>
           <w:b/>
           <w:bCs/>
-          <w:color w:val="0A369D"/>
+          <w:color w:val="1E293B"/>
           <w:sz w:val="22"/>
           <w:szCs w:val="22"/>
         </w:rPr>
@@ -2954,7 +2810,7 @@
           <w:rFonts w:ascii="Segoe UI" w:cs="Segoe UI" w:eastAsia="Segoe UI" w:hAnsi="Segoe UI"/>
           <w:b/>
           <w:bCs/>
-          <w:color w:val="0A369D"/>
+          <w:color w:val="1E293B"/>
           <w:sz w:val="22"/>
           <w:szCs w:val="22"/>
         </w:rPr>
@@ -2984,7 +2840,7 @@
           <w:sz w:val="22"/>
           <w:szCs w:val="22"/>
         </w:rPr>
-        <w:t xml:space="preserve">"Hủy liên kết (Unlink / Reset Device)"</w:t>
+        <w:t xml:space="preserve">"Hủy liên kết (Mở khóa thiết bị)"</w:t>
       </w:r>
       <w:r>
         <w:rPr>
@@ -3010,7 +2866,7 @@
           <w:rFonts w:ascii="Segoe UI" w:cs="Segoe UI" w:eastAsia="Segoe UI" w:hAnsi="Segoe UI"/>
           <w:b/>
           <w:bCs/>
-          <w:color w:val="0A369D"/>
+          <w:color w:val="1E293B"/>
           <w:sz w:val="22"/>
           <w:szCs w:val="22"/>
         </w:rPr>
@@ -3058,9 +2914,9 @@
           <w:rFonts w:ascii="Segoe UI" w:cs="Segoe UI" w:eastAsia="Segoe UI" w:hAnsi="Segoe UI"/>
           <w:b/>
           <w:bCs/>
-          <w:color w:val="0A369D"/>
-          <w:sz w:val="36"/>
-          <w:szCs w:val="36"/>
+          <w:color w:val="1E293B"/>
+          <w:sz w:val="34"/>
+          <w:szCs w:val="34"/>
         </w:rPr>
         <w:t xml:space="preserve">5. CẤU HÌNH THAM SỐ CHẤM CÔNG &amp; GIỜ LÀM VIỆC</w:t>
       </w:r>
@@ -3075,7 +2931,7 @@
           <wp:inline distT="0" distB="0" distL="0" distR="0">
             <wp:extent cx="5143500" cy="3219450"/>
             <wp:effectExtent t="0" r="0" b="0" l="0"/>
-            <wp:docPr id="17" name="" descr="" title=""/>
+            <wp:docPr id="18" name="" descr="" title=""/>
             <wp:cNvGraphicFramePr>
               <a:graphicFrameLocks xmlns:a="http://schemas.openxmlformats.org/drawingml/2006/main" noChangeAspect="1"/>
             </wp:cNvGraphicFramePr>
@@ -3156,7 +3012,7 @@
           <w:rFonts w:ascii="Segoe UI" w:cs="Segoe UI" w:eastAsia="Segoe UI" w:hAnsi="Segoe UI"/>
           <w:b/>
           <w:bCs/>
-          <w:color w:val="0A369D"/>
+          <w:color w:val="1E293B"/>
           <w:sz w:val="22"/>
           <w:szCs w:val="22"/>
         </w:rPr>
@@ -3212,7 +3068,7 @@
           <w:rFonts w:ascii="Segoe UI" w:cs="Segoe UI" w:eastAsia="Segoe UI" w:hAnsi="Segoe UI"/>
           <w:b/>
           <w:bCs/>
-          <w:color w:val="0A369D"/>
+          <w:color w:val="1E293B"/>
           <w:sz w:val="22"/>
           <w:szCs w:val="22"/>
         </w:rPr>
@@ -3491,7 +3347,7 @@
           <w:rFonts w:ascii="Segoe UI" w:cs="Segoe UI" w:eastAsia="Segoe UI" w:hAnsi="Segoe UI"/>
           <w:b/>
           <w:bCs/>
-          <w:color w:val="0A369D"/>
+          <w:color w:val="1E293B"/>
           <w:sz w:val="22"/>
           <w:szCs w:val="22"/>
         </w:rPr>
@@ -3565,9 +3421,9 @@
           <w:rFonts w:ascii="Segoe UI" w:cs="Segoe UI" w:eastAsia="Segoe UI" w:hAnsi="Segoe UI"/>
           <w:b/>
           <w:bCs/>
-          <w:color w:val="0A369D"/>
-          <w:sz w:val="36"/>
-          <w:szCs w:val="36"/>
+          <w:color w:val="1E293B"/>
+          <w:sz w:val="34"/>
+          <w:szCs w:val="34"/>
         </w:rPr>
         <w:t xml:space="preserve">6. TÙY BIẾN THƯƠNG HIỆU &amp; GIAO DIỆN NỀN TẢNG (PLATFORM BRANDING)</w:t>
       </w:r>
@@ -3600,7 +3456,7 @@
           <wp:inline distT="0" distB="0" distL="0" distR="0">
             <wp:extent cx="5143500" cy="3219450"/>
             <wp:effectExtent t="0" r="0" b="0" l="0"/>
-            <wp:docPr id="18" name="" descr="" title=""/>
+            <wp:docPr id="19" name="" descr="" title=""/>
             <wp:cNvGraphicFramePr>
               <a:graphicFrameLocks xmlns:a="http://schemas.openxmlformats.org/drawingml/2006/main" noChangeAspect="1"/>
             </wp:cNvGraphicFramePr>
@@ -3663,7 +3519,7 @@
           <w:rFonts w:ascii="Segoe UI" w:cs="Segoe UI" w:eastAsia="Segoe UI" w:hAnsi="Segoe UI"/>
           <w:b/>
           <w:bCs/>
-          <w:color w:val="0A369D"/>
+          <w:color w:val="1E293B"/>
           <w:sz w:val="22"/>
           <w:szCs w:val="22"/>
         </w:rPr>
@@ -3719,7 +3575,7 @@
           <w:rFonts w:ascii="Segoe UI" w:cs="Segoe UI" w:eastAsia="Segoe UI" w:hAnsi="Segoe UI"/>
           <w:b/>
           <w:bCs/>
-          <w:color w:val="0A369D"/>
+          <w:color w:val="1E293B"/>
           <w:sz w:val="22"/>
           <w:szCs w:val="22"/>
         </w:rPr>
@@ -3981,7 +3837,7 @@
           <w:rFonts w:ascii="Segoe UI" w:cs="Segoe UI" w:eastAsia="Segoe UI" w:hAnsi="Segoe UI"/>
           <w:b/>
           <w:bCs/>
-          <w:color w:val="0A369D"/>
+          <w:color w:val="1E293B"/>
           <w:sz w:val="22"/>
           <w:szCs w:val="22"/>
         </w:rPr>
@@ -4055,9 +3911,9 @@
           <w:rFonts w:ascii="Segoe UI" w:cs="Segoe UI" w:eastAsia="Segoe UI" w:hAnsi="Segoe UI"/>
           <w:b/>
           <w:bCs/>
-          <w:color w:val="0A369D"/>
-          <w:sz w:val="36"/>
-          <w:szCs w:val="36"/>
+          <w:color w:val="1E293B"/>
+          <w:sz w:val="34"/>
+          <w:szCs w:val="34"/>
         </w:rPr>
         <w:t xml:space="preserve">7. THEO DÕI NHẬT KÝ HOẠT ĐỘNG &amp; BẢO MẬT</w:t>
       </w:r>
@@ -4090,7 +3946,7 @@
           <w:rFonts w:ascii="Segoe UI" w:cs="Segoe UI" w:eastAsia="Segoe UI" w:hAnsi="Segoe UI"/>
           <w:b/>
           <w:bCs/>
-          <w:color w:val="0A369D"/>
+          <w:color w:val="1E293B"/>
           <w:sz w:val="22"/>
           <w:szCs w:val="22"/>
         </w:rPr>
@@ -4146,7 +4002,7 @@
           <w:rFonts w:ascii="Segoe UI" w:cs="Segoe UI" w:eastAsia="Segoe UI" w:hAnsi="Segoe UI"/>
           <w:b/>
           <w:bCs/>
-          <w:color w:val="0A369D"/>
+          <w:color w:val="1E293B"/>
           <w:sz w:val="22"/>
           <w:szCs w:val="22"/>
         </w:rPr>
@@ -4268,7 +4124,7 @@
           <w:rFonts w:ascii="Segoe UI" w:cs="Segoe UI" w:eastAsia="Segoe UI" w:hAnsi="Segoe UI"/>
           <w:b/>
           <w:bCs/>
-          <w:color w:val="0A369D"/>
+          <w:color w:val="1E293B"/>
           <w:sz w:val="22"/>
           <w:szCs w:val="22"/>
         </w:rPr>
@@ -4342,9 +4198,9 @@
           <w:rFonts w:ascii="Segoe UI" w:cs="Segoe UI" w:eastAsia="Segoe UI" w:hAnsi="Segoe UI"/>
           <w:b/>
           <w:bCs/>
-          <w:color w:val="0A369D"/>
-          <w:sz w:val="36"/>
-          <w:szCs w:val="36"/>
+          <w:color w:val="1E293B"/>
+          <w:sz w:val="34"/>
+          <w:szCs w:val="34"/>
         </w:rPr>
         <w:t xml:space="preserve">8. CÁC LƯU Ý KỸ THUẬT QUAN TRỌNG CHO QUẢN TRỊ VIÊN</w:t>
       </w:r>

</xml_diff>